<commit_message>
Complete Milestones 3, 4, and 5: Add 3NF schema, mock data pipelines, and validation checks
</commit_message>
<xml_diff>
--- a/Discription.docx
+++ b/Discription.docx
@@ -389,6 +389,20 @@
           <w:bCs/>
         </w:rPr>
       </w:pPr>
+      <w:r>
+        <w:rPr>
+          <w:b/>
+          <w:bCs/>
+        </w:rPr>
+        <w:t xml:space="preserve">Repository link: </w:t>
+      </w:r>
+      <w:r>
+        <w:rPr>
+          <w:b/>
+          <w:bCs/>
+        </w:rPr>
+        <w:t>https://github.com/ayham016/Database-theory-</w:t>
+      </w:r>
     </w:p>
     <w:p>
       <w:r>
@@ -572,15 +586,7 @@
         <w:t>Justification:</w:t>
       </w:r>
       <w:r>
-        <w:t xml:space="preserve"> Optimized for 3NF by utilizing a foreign key reference (</w:t>
-      </w:r>
-      <w:proofErr w:type="spellStart"/>
-      <w:r>
-        <w:t>department_id</w:t>
-      </w:r>
-      <w:proofErr w:type="spellEnd"/>
-      <w:r>
-        <w:t xml:space="preserve">) linking back to the master department infrastructure. This removes any descriptive department text duplication and safeguards the table against update anomalies. </w:t>
+        <w:t xml:space="preserve"> Optimized for 3NF by utilizing a foreign key reference (department_id) linking back to the master department infrastructure. This removes any descriptive department text duplication and safeguards the table against update anomalies. </w:t>
       </w:r>
     </w:p>
     <w:p>
@@ -645,23 +651,7 @@
       </w:r>
       <w:r>
         <w:lastRenderedPageBreak/>
-        <w:t>$\text{address\_id} \</w:t>
-      </w:r>
-      <w:proofErr w:type="spellStart"/>
-      <w:r>
-        <w:t>rightarrow</w:t>
-      </w:r>
-      <w:proofErr w:type="spellEnd"/>
-      <w:r>
-        <w:t xml:space="preserve"> \text{postal\_code} \</w:t>
-      </w:r>
-      <w:proofErr w:type="spellStart"/>
-      <w:r>
-        <w:t>rightarrow</w:t>
-      </w:r>
-      <w:proofErr w:type="spellEnd"/>
-      <w:r>
-        <w:t xml:space="preserve"> \</w:t>
+        <w:t>$\text{address\_id} \rightarrow \text{postal\_code} \rightarrow \</w:t>
       </w:r>
       <w:proofErr w:type="gramStart"/>
       <w:r>
@@ -1035,15 +1025,7 @@
         <w:t>Justification:</w:t>
       </w:r>
       <w:r>
-        <w:t xml:space="preserve"> Tailored for 3NF by using a clean foreign key relationship (</w:t>
-      </w:r>
-      <w:proofErr w:type="spellStart"/>
-      <w:r>
-        <w:t>assigned_to</w:t>
-      </w:r>
-      <w:proofErr w:type="spellEnd"/>
-      <w:r>
-        <w:t xml:space="preserve"> pointing to the USERS table). This tracks task allocations dynamically without copying over names or emails. </w:t>
+        <w:t xml:space="preserve"> Tailored for 3NF by using a clean foreign key relationship (assigned_to pointing to the USERS table). This tracks task allocations dynamically without copying over names or emails. </w:t>
       </w:r>
     </w:p>
     <w:p>
@@ -1094,15 +1076,7 @@
         <w:t>Justification:</w:t>
       </w:r>
       <w:r>
-        <w:t xml:space="preserve"> Fixed transitive loopholes by linking form submissions directly to a user ID via the </w:t>
-      </w:r>
-      <w:proofErr w:type="spellStart"/>
-      <w:r>
-        <w:t>submitted_by</w:t>
-      </w:r>
-      <w:proofErr w:type="spellEnd"/>
-      <w:r>
-        <w:t xml:space="preserve"> foreign key. The form entry remains completely independent of changing user details. </w:t>
+        <w:t xml:space="preserve"> Fixed transitive loopholes by linking form submissions directly to a user ID via the submitted_by foreign key. The form entry remains completely independent of changing user details. </w:t>
       </w:r>
     </w:p>
     <w:p>
@@ -1226,23 +1200,7 @@
         <w:t>Justification:</w:t>
       </w:r>
       <w:r>
-        <w:t xml:space="preserve"> Upgraded to 3NF. The original blueprint stored the trainer's department and designation as hardcoded text. These were refactored into normalized foreign keys (</w:t>
-      </w:r>
-      <w:proofErr w:type="spellStart"/>
-      <w:r>
-        <w:t>department_id</w:t>
-      </w:r>
-      <w:proofErr w:type="spellEnd"/>
-      <w:r>
-        <w:t xml:space="preserve">, </w:t>
-      </w:r>
-      <w:proofErr w:type="spellStart"/>
-      <w:r>
-        <w:t>designation_id</w:t>
-      </w:r>
-      <w:proofErr w:type="spellEnd"/>
-      <w:r>
-        <w:t xml:space="preserve">) pointing back to your core master tables. </w:t>
+        <w:t xml:space="preserve"> Upgraded to 3NF. The original blueprint stored the trainer's department and designation as hardcoded text. These were refactored into normalized foreign keys (department_id, designation_id) pointing back to your core master tables. </w:t>
       </w:r>
     </w:p>
     <w:p>
@@ -1353,39 +1311,7 @@
         <w:t>Justification:</w:t>
       </w:r>
       <w:r>
-        <w:t xml:space="preserve"> Upgraded to 3NF by completely stripping out the </w:t>
-      </w:r>
-      <w:proofErr w:type="spellStart"/>
-      <w:r>
-        <w:t>start_date</w:t>
-      </w:r>
-      <w:proofErr w:type="spellEnd"/>
-      <w:r>
-        <w:t xml:space="preserve"> and </w:t>
-      </w:r>
-      <w:proofErr w:type="spellStart"/>
-      <w:r>
-        <w:t>end_date</w:t>
-      </w:r>
-      <w:proofErr w:type="spellEnd"/>
-      <w:r>
-        <w:t xml:space="preserve"> fields. Because those dates are functionally determined by the batch schedule itself, keeping them here created a transitive dependency flaw ($\text{assignment\_id} \</w:t>
-      </w:r>
-      <w:proofErr w:type="spellStart"/>
-      <w:r>
-        <w:t>rightarrow</w:t>
-      </w:r>
-      <w:proofErr w:type="spellEnd"/>
-      <w:r>
-        <w:t xml:space="preserve"> \text{batch\_id} \</w:t>
-      </w:r>
-      <w:proofErr w:type="spellStart"/>
-      <w:r>
-        <w:t>rightarrow</w:t>
-      </w:r>
-      <w:proofErr w:type="spellEnd"/>
-      <w:r>
-        <w:t xml:space="preserve"> \text{start\_</w:t>
+        <w:t xml:space="preserve"> Upgraded to 3NF by completely stripping out the start_date and end_date fields. Because those dates are functionally determined by the batch schedule itself, keeping them here created a transitive dependency flaw ($\text{assignment\_id} \rightarrow \text{batch\_id} \rightarrow \text{start\_</w:t>
       </w:r>
       <w:proofErr w:type="gramStart"/>
       <w:r>
@@ -1546,15 +1472,7 @@
         <w:t>Justification:</w:t>
       </w:r>
       <w:r>
-        <w:t xml:space="preserve"> Achieves 3NF by utilizing the </w:t>
-      </w:r>
-      <w:proofErr w:type="spellStart"/>
-      <w:r>
-        <w:t>evaluated_by</w:t>
-      </w:r>
-      <w:proofErr w:type="spellEnd"/>
-      <w:r>
-        <w:t xml:space="preserve"> foreign key linking straight to the USERS access domain, which prevents grading records from holding duplicated evaluator details. </w:t>
+        <w:t xml:space="preserve"> Achieves 3NF by utilizing the evaluated_by foreign key linking straight to the USERS access domain, which prevents grading records from holding duplicated evaluator details. </w:t>
       </w:r>
     </w:p>
     <w:p>
@@ -1657,15 +1575,7 @@
         <w:t>Justification:</w:t>
       </w:r>
       <w:r>
-        <w:t xml:space="preserve"> Satisfies 3NF rules by ensuring the issuing authority metadata tracks uniquely to a user identifier via </w:t>
-      </w:r>
-      <w:proofErr w:type="spellStart"/>
-      <w:r>
-        <w:t>issued_by</w:t>
-      </w:r>
-      <w:proofErr w:type="spellEnd"/>
-      <w:r>
-        <w:t xml:space="preserve"> without relying on repeated text blocks. </w:t>
+        <w:t xml:space="preserve"> Satisfies 3NF rules by ensuring the issuing authority metadata tracks uniquely to a user identifier via issued_by without relying on repeated text blocks. </w:t>
       </w:r>
     </w:p>
     <w:p>
@@ -1738,15 +1648,7 @@
         <w:t>Justification:</w:t>
       </w:r>
       <w:r>
-        <w:t xml:space="preserve"> Configured to enforce 3NF rules across application layers. It relies on a UNIQUE foreign key for </w:t>
-      </w:r>
-      <w:proofErr w:type="spellStart"/>
-      <w:r>
-        <w:t>employee_id</w:t>
-      </w:r>
-      <w:proofErr w:type="spellEnd"/>
-      <w:r>
-        <w:t xml:space="preserve"> to build a clean 1:1 security account layer for employees without duplicating core personnel information. </w:t>
+        <w:t xml:space="preserve"> Configured to enforce 3NF rules across application layers. It relies on a UNIQUE foreign key for employee_id to build a clean 1:1 security account layer for employees without duplicating core personnel information. </w:t>
       </w:r>
     </w:p>
     <w:p>
@@ -1800,6 +1702,1340 @@
         <w:t xml:space="preserve"> Fulfills 1NF requirements by packaging runtime configuration options into single, atomic metadata parameters mapped directly to the report ID wrapper. </w:t>
       </w:r>
     </w:p>
+    <w:p>
+      <w:r>
+        <w:rPr>
+          <w:b/>
+          <w:bCs/>
+        </w:rPr>
+        <w:t>Milestone 3: Dataflow Description &amp; Dataset Preparation</w:t>
+      </w:r>
+    </w:p>
+    <w:p>
+      <w:r>
+        <w:t>Data enters the system through two main entry points: User Management/Authentication and Core Employee Management.</w:t>
+      </w:r>
+    </w:p>
+    <w:p>
+      <w:pPr>
+        <w:numPr>
+          <w:ilvl w:val="0"/>
+          <w:numId w:val="26"/>
+        </w:numPr>
+      </w:pPr>
+      <w:r>
+        <w:t>Organizational Foundation: Master infrastructure data (DEPARTMENTS, DESIGNATIONS, and POSTAL_CODES) is populated first. This data acts as a strict lookup constraint validation boundary.</w:t>
+      </w:r>
+    </w:p>
+    <w:p>
+      <w:pPr>
+        <w:numPr>
+          <w:ilvl w:val="0"/>
+          <w:numId w:val="26"/>
+        </w:numPr>
+      </w:pPr>
+      <w:r>
+        <w:t>Employee Onboarding: New staff profiles land directly into the EMPLOYEES table. Transactional tables (ADDRESSES, EMERGENCY_CONTACTS, EDUCATION, PREVIOUS_EMPLOYMENT, BANK_DETAILS) are populated simultaneously, alongside operational checklist logs (ONBOARDING_TASKS, ONBOARDING_FORMS).</w:t>
+      </w:r>
+    </w:p>
+    <w:p>
+      <w:pPr>
+        <w:numPr>
+          <w:ilvl w:val="0"/>
+          <w:numId w:val="26"/>
+        </w:numPr>
+      </w:pPr>
+      <w:r>
+        <w:t>Application Layer Access: Security credentials are built inside the USERS table, establishing system role boundaries (Admin, HR, Manager, Trainer).</w:t>
+      </w:r>
+    </w:p>
+    <w:p>
+      <w:pPr>
+        <w:numPr>
+          <w:ilvl w:val="0"/>
+          <w:numId w:val="26"/>
+        </w:numPr>
+      </w:pPr>
+      <w:r>
+        <w:lastRenderedPageBreak/>
+        <w:t>Training Lifecycles: Course plans (TRAINING_PROGRAMS) and instructors (TRAINERS) merge to spawn dynamic target schedules in TRAINING_BATCHES.</w:t>
+      </w:r>
+    </w:p>
+    <w:p>
+      <w:pPr>
+        <w:numPr>
+          <w:ilvl w:val="0"/>
+          <w:numId w:val="26"/>
+        </w:numPr>
+      </w:pPr>
+      <w:r>
+        <w:t>Operational Execution: Employees are enrolled via TRAINING_ASSIGNMENTS. Daily operations flow into event logs (TRAINING_SESSIONS, TRAINING_ATTENDANCE, TRAINING_ASSESSMENTS, TRAINING_FEEDBACK) and static credentials (TRAINING_CERTIFICATES).</w:t>
+      </w:r>
+    </w:p>
+    <w:p>
+      <w:r>
+        <w:rPr>
+          <w:b/>
+          <w:bCs/>
+        </w:rPr>
+        <w:t>Synthetic Dataset Implementation:</w:t>
+      </w:r>
+    </w:p>
+    <w:p>
+      <w:r>
+        <w:t>A robust mock dataset of 20+ records per table (spanning all 23 tables) was generated using structured CSV format. This approach ensures that all primary keys, foreign keys, and relational constraints map perfectly during bulk insertion.</w:t>
+      </w:r>
+    </w:p>
+    <w:p>
+      <w:r>
+        <w:rPr>
+          <w:b/>
+          <w:bCs/>
+        </w:rPr>
+        <w:t>Milestones 1 &amp; 2: 3NF Normalization Justifications</w:t>
+      </w:r>
+    </w:p>
+    <w:p>
+      <w:r>
+        <w:rPr>
+          <w:b/>
+          <w:bCs/>
+        </w:rPr>
+        <w:t>First Normal Form (1NF):</w:t>
+      </w:r>
+      <w:r>
+        <w:t xml:space="preserve"> Applied globally across the schema. All repeating groups and multi-valued attributes (e.g., arrays of previous jobs, educational degrees, or multiple addresses) were decoupled into standalone transactional tables (EDUCATION, PREVIOUS_EMPLOYMENT, ADDRESSES, EMERGENCY_CONTACTS) to ensure strict data atomicity.</w:t>
+      </w:r>
+    </w:p>
+    <w:p>
+      <w:r>
+        <w:rPr>
+          <w:b/>
+          <w:bCs/>
+        </w:rPr>
+        <w:t>Second Normal Form (2NF):</w:t>
+      </w:r>
+      <w:r>
+        <w:t xml:space="preserve"> Achieved globally. Because every table in this schema utilizes an isolated, single-column Surrogate Primary Key (e.g., employee_id, batch_id, task_id), partial dependencies on composite keys are mathematically impossible.</w:t>
+      </w:r>
+    </w:p>
+    <w:p>
+      <w:r>
+        <w:rPr>
+          <w:b/>
+          <w:bCs/>
+        </w:rPr>
+        <w:t>Third Normal Form (3NF):</w:t>
+      </w:r>
+      <w:r>
+        <w:t xml:space="preserve"> Applied to eliminate all transitive dependencies (where a non-key attribute depends on another non-key attribute). Key 3NF upgrades include:</w:t>
+      </w:r>
+    </w:p>
+    <w:p>
+      <w:r>
+        <w:t>• POSTAL_CODES: Extracted city, state, and country out of the ADDRESSES table to prevent the transitive loop (address_id -&gt; postal_code -&gt; city). • TRAINERS: Replaced literal text string descriptors with normalized foreign keys (department_id, designation_id) linking back to the corporate infrastructure. • TRAINING_ASSIGNMENTS: Stripped out start_date and end_date fields. Because these were functionally determined by the batch schedule, keeping them in the assignment table created a transitive vulnerability. • USERS &amp; DOCUMENTS: Linked document verifications and task assignments directly to a unique user_id rather than duplicating employee string names.</w:t>
+      </w:r>
+    </w:p>
+    <w:p>
+      <w:r>
+        <w:rPr>
+          <w:b/>
+          <w:bCs/>
+        </w:rPr>
+        <w:t>Milestone 4: Data Definition Language (DDL)</w:t>
+      </w:r>
+    </w:p>
+    <w:p>
+      <w:r>
+        <w:t>The following script generates the schema, enforces all PK/FK relationships, and applies necessary NOT NULL and CHECK constraints.</w:t>
+      </w:r>
+    </w:p>
+    <w:p>
+      <w:r>
+        <w:t>CREATE DATABASE IF NOT EXISTS EmployeeLifecycleDB;</w:t>
+      </w:r>
+    </w:p>
+    <w:p>
+      <w:r>
+        <w:lastRenderedPageBreak/>
+        <w:t>USE EmployeeLifecycleDB;</w:t>
+      </w:r>
+    </w:p>
+    <w:p/>
+    <w:p>
+      <w:r>
+        <w:t>CREATE TABLE DEPARTMENTS (</w:t>
+      </w:r>
+    </w:p>
+    <w:p>
+      <w:r>
+        <w:t>department_id INT NOT NULL,</w:t>
+      </w:r>
+    </w:p>
+    <w:p>
+      <w:r>
+        <w:t xml:space="preserve">department_name </w:t>
+      </w:r>
+      <w:proofErr w:type="gramStart"/>
+      <w:r>
+        <w:t>VARCHAR(</w:t>
+      </w:r>
+      <w:proofErr w:type="gramEnd"/>
+      <w:r>
+        <w:t>100) NOT NULL,</w:t>
+      </w:r>
+    </w:p>
+    <w:p>
+      <w:r>
+        <w:t>description TEXT NULL,</w:t>
+      </w:r>
+    </w:p>
+    <w:p>
+      <w:r>
+        <w:t xml:space="preserve">status </w:t>
+      </w:r>
+      <w:proofErr w:type="gramStart"/>
+      <w:r>
+        <w:t>VARCHAR(</w:t>
+      </w:r>
+      <w:proofErr w:type="gramEnd"/>
+      <w:r>
+        <w:t>20) DEFAULT 'Active',</w:t>
+      </w:r>
+    </w:p>
+    <w:p>
+      <w:r>
+        <w:t>PRIMARY KEY (department_id),</w:t>
+      </w:r>
+    </w:p>
+    <w:p>
+      <w:r>
+        <w:t>CONSTRAINT chk_dept_status CHECK (status IN ('Active', 'Inactive'))</w:t>
+      </w:r>
+    </w:p>
+    <w:p>
+      <w:r>
+        <w:t>) ENGINE=InnoDB;</w:t>
+      </w:r>
+    </w:p>
+    <w:p/>
+    <w:p>
+      <w:r>
+        <w:t>CREATE TABLE DESIGNATIONS (</w:t>
+      </w:r>
+    </w:p>
+    <w:p>
+      <w:r>
+        <w:t>designation_id INT NOT NULL,</w:t>
+      </w:r>
+    </w:p>
+    <w:p>
+      <w:r>
+        <w:t xml:space="preserve">designation_name </w:t>
+      </w:r>
+      <w:proofErr w:type="gramStart"/>
+      <w:r>
+        <w:t>VARCHAR(</w:t>
+      </w:r>
+      <w:proofErr w:type="gramEnd"/>
+      <w:r>
+        <w:t>100) NOT NULL,</w:t>
+      </w:r>
+    </w:p>
+    <w:p>
+      <w:r>
+        <w:t>department_id INT NOT NULL,</w:t>
+      </w:r>
+    </w:p>
+    <w:p>
+      <w:r>
+        <w:t>description TEXT NULL,</w:t>
+      </w:r>
+    </w:p>
+    <w:p>
+      <w:r>
+        <w:t xml:space="preserve">status </w:t>
+      </w:r>
+      <w:proofErr w:type="gramStart"/>
+      <w:r>
+        <w:t>VARCHAR(</w:t>
+      </w:r>
+      <w:proofErr w:type="gramEnd"/>
+      <w:r>
+        <w:t>20) DEFAULT 'Active',</w:t>
+      </w:r>
+    </w:p>
+    <w:p>
+      <w:r>
+        <w:t>PRIMARY KEY (designation_id),</w:t>
+      </w:r>
+    </w:p>
+    <w:p>
+      <w:r>
+        <w:t xml:space="preserve">FOREIGN KEY (department_id) REFERENCES </w:t>
+      </w:r>
+      <w:proofErr w:type="gramStart"/>
+      <w:r>
+        <w:t>DEPARTMENTS(</w:t>
+      </w:r>
+      <w:proofErr w:type="gramEnd"/>
+      <w:r>
+        <w:t>department_id) ON DELETE RESTRICT</w:t>
+      </w:r>
+    </w:p>
+    <w:p>
+      <w:r>
+        <w:t>ON UPDATE CASCADE,</w:t>
+      </w:r>
+    </w:p>
+    <w:p>
+      <w:r>
+        <w:t>CONSTRAINT chk_desig_status CHECK (status IN ('Active', 'Inactive'))</w:t>
+      </w:r>
+    </w:p>
+    <w:p>
+      <w:r>
+        <w:t>) ENGINE=InnoDB;</w:t>
+      </w:r>
+    </w:p>
+    <w:p/>
+    <w:p>
+      <w:r>
+        <w:t>CREATE TABLE POSTAL_CODES (</w:t>
+      </w:r>
+    </w:p>
+    <w:p>
+      <w:r>
+        <w:t xml:space="preserve">postal_code </w:t>
+      </w:r>
+      <w:proofErr w:type="gramStart"/>
+      <w:r>
+        <w:t>VARCHAR(</w:t>
+      </w:r>
+      <w:proofErr w:type="gramEnd"/>
+      <w:r>
+        <w:t>20) NOT NULL,</w:t>
+      </w:r>
+    </w:p>
+    <w:p>
+      <w:r>
+        <w:lastRenderedPageBreak/>
+        <w:t xml:space="preserve">city </w:t>
+      </w:r>
+      <w:proofErr w:type="gramStart"/>
+      <w:r>
+        <w:t>VARCHAR(</w:t>
+      </w:r>
+      <w:proofErr w:type="gramEnd"/>
+      <w:r>
+        <w:t>50) NOT NULL,</w:t>
+      </w:r>
+    </w:p>
+    <w:p>
+      <w:r>
+        <w:t xml:space="preserve">state </w:t>
+      </w:r>
+      <w:proofErr w:type="gramStart"/>
+      <w:r>
+        <w:t>VARCHAR(</w:t>
+      </w:r>
+      <w:proofErr w:type="gramEnd"/>
+      <w:r>
+        <w:t>50) NOT NULL,</w:t>
+      </w:r>
+    </w:p>
+    <w:p>
+      <w:r>
+        <w:t xml:space="preserve">country </w:t>
+      </w:r>
+      <w:proofErr w:type="gramStart"/>
+      <w:r>
+        <w:t>VARCHAR(</w:t>
+      </w:r>
+      <w:proofErr w:type="gramEnd"/>
+      <w:r>
+        <w:t>50) NOT NULL,</w:t>
+      </w:r>
+    </w:p>
+    <w:p>
+      <w:r>
+        <w:t>PRIMARY KEY (postal_code)</w:t>
+      </w:r>
+    </w:p>
+    <w:p>
+      <w:r>
+        <w:t>) ENGINE=InnoDB;</w:t>
+      </w:r>
+    </w:p>
+    <w:p/>
+    <w:p>
+      <w:r>
+        <w:t>CREATE TABLE EMPLOYEES (</w:t>
+      </w:r>
+    </w:p>
+    <w:p>
+      <w:r>
+        <w:t>employee_id INT NOT NULL,</w:t>
+      </w:r>
+    </w:p>
+    <w:p>
+      <w:r>
+        <w:t xml:space="preserve">employee_code </w:t>
+      </w:r>
+      <w:proofErr w:type="gramStart"/>
+      <w:r>
+        <w:t>VARCHAR(</w:t>
+      </w:r>
+      <w:proofErr w:type="gramEnd"/>
+      <w:r>
+        <w:t>50) NOT NULL,</w:t>
+      </w:r>
+    </w:p>
+    <w:p>
+      <w:r>
+        <w:t xml:space="preserve">first_name </w:t>
+      </w:r>
+      <w:proofErr w:type="gramStart"/>
+      <w:r>
+        <w:t>VARCHAR(</w:t>
+      </w:r>
+      <w:proofErr w:type="gramEnd"/>
+      <w:r>
+        <w:t>50) NOT NULL,</w:t>
+      </w:r>
+    </w:p>
+    <w:p>
+      <w:r>
+        <w:t xml:space="preserve">last_name </w:t>
+      </w:r>
+      <w:proofErr w:type="gramStart"/>
+      <w:r>
+        <w:t>VARCHAR(</w:t>
+      </w:r>
+      <w:proofErr w:type="gramEnd"/>
+      <w:r>
+        <w:t>50) NOT NULL,</w:t>
+      </w:r>
+    </w:p>
+    <w:p>
+      <w:r>
+        <w:t xml:space="preserve">email </w:t>
+      </w:r>
+      <w:proofErr w:type="gramStart"/>
+      <w:r>
+        <w:t>VARCHAR(</w:t>
+      </w:r>
+      <w:proofErr w:type="gramEnd"/>
+      <w:r>
+        <w:t>100) NOT NULL,</w:t>
+      </w:r>
+    </w:p>
+    <w:p>
+      <w:r>
+        <w:t xml:space="preserve">phone </w:t>
+      </w:r>
+      <w:proofErr w:type="gramStart"/>
+      <w:r>
+        <w:t>VARCHAR(</w:t>
+      </w:r>
+      <w:proofErr w:type="gramEnd"/>
+      <w:r>
+        <w:t>20) NULL,</w:t>
+      </w:r>
+    </w:p>
+    <w:p>
+      <w:r>
+        <w:t>date_of_birth DATE NULL,</w:t>
+      </w:r>
+    </w:p>
+    <w:p>
+      <w:r>
+        <w:t xml:space="preserve">gender </w:t>
+      </w:r>
+      <w:proofErr w:type="gramStart"/>
+      <w:r>
+        <w:t>VARCHAR(</w:t>
+      </w:r>
+      <w:proofErr w:type="gramEnd"/>
+      <w:r>
+        <w:t>15) NULL,</w:t>
+      </w:r>
+    </w:p>
+    <w:p>
+      <w:r>
+        <w:t xml:space="preserve">marital_status </w:t>
+      </w:r>
+      <w:proofErr w:type="gramStart"/>
+      <w:r>
+        <w:t>VARCHAR(</w:t>
+      </w:r>
+      <w:proofErr w:type="gramEnd"/>
+      <w:r>
+        <w:t>15) NULL,</w:t>
+      </w:r>
+    </w:p>
+    <w:p>
+      <w:r>
+        <w:t xml:space="preserve">national_id_no </w:t>
+      </w:r>
+      <w:proofErr w:type="gramStart"/>
+      <w:r>
+        <w:t>VARCHAR(</w:t>
+      </w:r>
+      <w:proofErr w:type="gramEnd"/>
+      <w:r>
+        <w:t>50) NOT NULL,</w:t>
+      </w:r>
+    </w:p>
+    <w:p>
+      <w:r>
+        <w:t>join_date DATE NOT NULL,</w:t>
+      </w:r>
+    </w:p>
+    <w:p>
+      <w:r>
+        <w:t>department_id INT NOT NULL,</w:t>
+      </w:r>
+    </w:p>
+    <w:p>
+      <w:r>
+        <w:t>designation_id INT NOT NULL,</w:t>
+      </w:r>
+    </w:p>
+    <w:p>
+      <w:r>
+        <w:t>manager_id INT NULL,</w:t>
+      </w:r>
+    </w:p>
+    <w:p>
+      <w:r>
+        <w:t xml:space="preserve">employment_type </w:t>
+      </w:r>
+      <w:proofErr w:type="gramStart"/>
+      <w:r>
+        <w:t>VARCHAR(</w:t>
+      </w:r>
+      <w:proofErr w:type="gramEnd"/>
+      <w:r>
+        <w:t>30) NOT NULL,</w:t>
+      </w:r>
+    </w:p>
+    <w:p>
+      <w:r>
+        <w:t xml:space="preserve">status </w:t>
+      </w:r>
+      <w:proofErr w:type="gramStart"/>
+      <w:r>
+        <w:t>VARCHAR(</w:t>
+      </w:r>
+      <w:proofErr w:type="gramEnd"/>
+      <w:r>
+        <w:t>20) DEFAULT 'Active',</w:t>
+      </w:r>
+    </w:p>
+    <w:p>
+      <w:r>
+        <w:t>PRIMARY KEY (employee_id),</w:t>
+      </w:r>
+    </w:p>
+    <w:p>
+      <w:r>
+        <w:t>UNIQUE KEY uq_emp_code (employee_code),</w:t>
+      </w:r>
+    </w:p>
+    <w:p>
+      <w:r>
+        <w:t>UNIQUE KEY uq_emp_email (email),</w:t>
+      </w:r>
+    </w:p>
+    <w:p>
+      <w:r>
+        <w:lastRenderedPageBreak/>
+        <w:t>UNIQUE KEY uq_emp_nat_id (national_id_no),</w:t>
+      </w:r>
+    </w:p>
+    <w:p>
+      <w:r>
+        <w:t xml:space="preserve">FOREIGN KEY (department_id) REFERENCES </w:t>
+      </w:r>
+      <w:proofErr w:type="gramStart"/>
+      <w:r>
+        <w:t>DEPARTMENTS(</w:t>
+      </w:r>
+      <w:proofErr w:type="gramEnd"/>
+      <w:r>
+        <w:t>department_id) ON DELETE RESTRICT</w:t>
+      </w:r>
+    </w:p>
+    <w:p>
+      <w:r>
+        <w:t>ON UPDATE CASCADE,</w:t>
+      </w:r>
+    </w:p>
+    <w:p>
+      <w:r>
+        <w:t xml:space="preserve">FOREIGN KEY (designation_id) REFERENCES </w:t>
+      </w:r>
+      <w:proofErr w:type="gramStart"/>
+      <w:r>
+        <w:t>DESIGNATIONS(</w:t>
+      </w:r>
+      <w:proofErr w:type="gramEnd"/>
+      <w:r>
+        <w:t>designation_id) ON DELETE</w:t>
+      </w:r>
+    </w:p>
+    <w:p>
+      <w:r>
+        <w:t>RESTRICT ON UPDATE CASCADE,</w:t>
+      </w:r>
+    </w:p>
+    <w:p>
+      <w:r>
+        <w:t xml:space="preserve">FOREIGN KEY (manager_id) REFERENCES </w:t>
+      </w:r>
+      <w:proofErr w:type="gramStart"/>
+      <w:r>
+        <w:t>EMPLOYEES(</w:t>
+      </w:r>
+      <w:proofErr w:type="gramEnd"/>
+      <w:r>
+        <w:t>employee_id) ON DELETE SET NULL ON</w:t>
+      </w:r>
+    </w:p>
+    <w:p>
+      <w:r>
+        <w:t>UPDATE CASCADE,</w:t>
+      </w:r>
+    </w:p>
+    <w:p>
+      <w:r>
+        <w:t>CONSTRAINT chk_emp_status CHECK (status IN ('Active', 'Terminated', 'Suspended', 'On</w:t>
+      </w:r>
+    </w:p>
+    <w:p>
+      <w:r>
+        <w:t>Leave')),</w:t>
+      </w:r>
+    </w:p>
+    <w:p>
+      <w:r>
+        <w:t>CONSTRAINT chk_emp_type CHECK (employment_type IN ('Full-Time', 'Part-Time',</w:t>
+      </w:r>
+    </w:p>
+    <w:p>
+      <w:r>
+        <w:t>'Contract', 'Intern'))</w:t>
+      </w:r>
+    </w:p>
+    <w:p>
+      <w:r>
+        <w:t>) ENGINE=InnoDB;</w:t>
+      </w:r>
+    </w:p>
+    <w:p/>
+    <w:p>
+      <w:r>
+        <w:t>CREATE TABLE USERS (</w:t>
+      </w:r>
+    </w:p>
+    <w:p>
+      <w:r>
+        <w:t>user_id INT NOT NULL,</w:t>
+      </w:r>
+    </w:p>
+    <w:p>
+      <w:r>
+        <w:t>employee_id INT NULL,</w:t>
+      </w:r>
+    </w:p>
+    <w:p>
+      <w:r>
+        <w:t xml:space="preserve">full_name </w:t>
+      </w:r>
+      <w:proofErr w:type="gramStart"/>
+      <w:r>
+        <w:t>VARCHAR(</w:t>
+      </w:r>
+      <w:proofErr w:type="gramEnd"/>
+      <w:r>
+        <w:t>100) NOT NULL,</w:t>
+      </w:r>
+    </w:p>
+    <w:p>
+      <w:r>
+        <w:t xml:space="preserve">email </w:t>
+      </w:r>
+      <w:proofErr w:type="gramStart"/>
+      <w:r>
+        <w:t>VARCHAR(</w:t>
+      </w:r>
+      <w:proofErr w:type="gramEnd"/>
+      <w:r>
+        <w:t>100) NOT NULL,</w:t>
+      </w:r>
+    </w:p>
+    <w:p>
+      <w:r>
+        <w:t xml:space="preserve">password_hash </w:t>
+      </w:r>
+      <w:proofErr w:type="gramStart"/>
+      <w:r>
+        <w:t>VARCHAR(</w:t>
+      </w:r>
+      <w:proofErr w:type="gramEnd"/>
+      <w:r>
+        <w:t>255) NOT NULL,</w:t>
+      </w:r>
+    </w:p>
+    <w:p>
+      <w:r>
+        <w:t xml:space="preserve">role </w:t>
+      </w:r>
+      <w:proofErr w:type="gramStart"/>
+      <w:r>
+        <w:t>VARCHAR(</w:t>
+      </w:r>
+      <w:proofErr w:type="gramEnd"/>
+      <w:r>
+        <w:t>20) NOT NULL,</w:t>
+      </w:r>
+    </w:p>
+    <w:p>
+      <w:r>
+        <w:t xml:space="preserve">status </w:t>
+      </w:r>
+      <w:proofErr w:type="gramStart"/>
+      <w:r>
+        <w:t>VARCHAR(</w:t>
+      </w:r>
+      <w:proofErr w:type="gramEnd"/>
+      <w:r>
+        <w:t>20) DEFAULT 'Active',</w:t>
+      </w:r>
+    </w:p>
+    <w:p>
+      <w:r>
+        <w:t>PRIMARY KEY (user_id),</w:t>
+      </w:r>
+    </w:p>
+    <w:p>
+      <w:r>
+        <w:t>UNIQUE KEY uq_user_email (email),</w:t>
+      </w:r>
+    </w:p>
+    <w:p>
+      <w:r>
+        <w:t>UNIQUE KEY uq_user_emp (employee_id),</w:t>
+      </w:r>
+    </w:p>
+    <w:p>
+      <w:r>
+        <w:lastRenderedPageBreak/>
+        <w:t xml:space="preserve">FOREIGN KEY (employee_id) REFERENCES </w:t>
+      </w:r>
+      <w:proofErr w:type="gramStart"/>
+      <w:r>
+        <w:t>EMPLOYEES(</w:t>
+      </w:r>
+      <w:proofErr w:type="gramEnd"/>
+      <w:r>
+        <w:t>employee_id) ON DELETE CASCADE ON</w:t>
+      </w:r>
+    </w:p>
+    <w:p>
+      <w:r>
+        <w:t>UPDATE CASCADE,</w:t>
+      </w:r>
+    </w:p>
+    <w:p>
+      <w:r>
+        <w:t>CONSTRAINT chk_user_role CHECK (role IN ('Admin', 'HR', 'Manager', 'Trainer'))</w:t>
+      </w:r>
+    </w:p>
+    <w:p>
+      <w:r>
+        <w:t>) ENGINE=InnoDB;</w:t>
+      </w:r>
+    </w:p>
+    <w:p/>
+    <w:p>
+      <w:r>
+        <w:t>CREATE TABLE ONBOARDING_TASKS (</w:t>
+      </w:r>
+    </w:p>
+    <w:p>
+      <w:r>
+        <w:t>task_id INT NOT NULL,</w:t>
+      </w:r>
+    </w:p>
+    <w:p>
+      <w:r>
+        <w:t>employee_id INT NOT NULL,</w:t>
+      </w:r>
+    </w:p>
+    <w:p>
+      <w:r>
+        <w:t xml:space="preserve">task_name </w:t>
+      </w:r>
+      <w:proofErr w:type="gramStart"/>
+      <w:r>
+        <w:t>VARCHAR(</w:t>
+      </w:r>
+      <w:proofErr w:type="gramEnd"/>
+      <w:r>
+        <w:t>150) NOT NULL,</w:t>
+      </w:r>
+    </w:p>
+    <w:p>
+      <w:r>
+        <w:t>assigned_to INT NULL,</w:t>
+      </w:r>
+    </w:p>
+    <w:p>
+      <w:r>
+        <w:t>due_date DATE NULL,</w:t>
+      </w:r>
+    </w:p>
+    <w:p>
+      <w:r>
+        <w:t xml:space="preserve">status </w:t>
+      </w:r>
+      <w:proofErr w:type="gramStart"/>
+      <w:r>
+        <w:t>VARCHAR(</w:t>
+      </w:r>
+      <w:proofErr w:type="gramEnd"/>
+      <w:r>
+        <w:t>20) DEFAULT 'Pending',</w:t>
+      </w:r>
+    </w:p>
+    <w:p>
+      <w:r>
+        <w:t>completed_date DATE NULL,</w:t>
+      </w:r>
+    </w:p>
+    <w:p>
+      <w:r>
+        <w:t>PRIMARY KEY (task_id),</w:t>
+      </w:r>
+    </w:p>
+    <w:p>
+      <w:r>
+        <w:t xml:space="preserve">FOREIGN KEY (employee_id) REFERENCES </w:t>
+      </w:r>
+      <w:proofErr w:type="gramStart"/>
+      <w:r>
+        <w:t>EMPLOYEES(</w:t>
+      </w:r>
+      <w:proofErr w:type="gramEnd"/>
+      <w:r>
+        <w:t>employee_id) ON DELETE CASCADE ON</w:t>
+      </w:r>
+    </w:p>
+    <w:p>
+      <w:r>
+        <w:t>UPDATE CASCADE,</w:t>
+      </w:r>
+    </w:p>
+    <w:p>
+      <w:r>
+        <w:t xml:space="preserve">FOREIGN KEY (assigned_to) REFERENCES </w:t>
+      </w:r>
+      <w:proofErr w:type="gramStart"/>
+      <w:r>
+        <w:t>USERS(</w:t>
+      </w:r>
+      <w:proofErr w:type="gramEnd"/>
+      <w:r>
+        <w:t>user_id) ON DELETE SET NULL ON UPDATE</w:t>
+      </w:r>
+    </w:p>
+    <w:p>
+      <w:r>
+        <w:t>CASCADE,</w:t>
+      </w:r>
+    </w:p>
+    <w:p>
+      <w:r>
+        <w:t>CONSTRAINT chk_task_status CHECK (status IN ('Pending', 'In Progress', 'Completed'))</w:t>
+      </w:r>
+    </w:p>
+    <w:p>
+      <w:r>
+        <w:t>) ENGINE=InnoDB;</w:t>
+      </w:r>
+    </w:p>
+    <w:p/>
+    <w:p>
+      <w:r>
+        <w:t>CREATE TABLE TRAINING_BATCHES (</w:t>
+      </w:r>
+    </w:p>
+    <w:p>
+      <w:r>
+        <w:t>batch_id INT NOT NULL,</w:t>
+      </w:r>
+    </w:p>
+    <w:p>
+      <w:r>
+        <w:t>program_id INT NOT NULL,</w:t>
+      </w:r>
+    </w:p>
+    <w:p>
+      <w:r>
+        <w:lastRenderedPageBreak/>
+        <w:t>trainer_id INT NOT NULL,</w:t>
+      </w:r>
+    </w:p>
+    <w:p>
+      <w:r>
+        <w:t xml:space="preserve">batch_name </w:t>
+      </w:r>
+      <w:proofErr w:type="gramStart"/>
+      <w:r>
+        <w:t>VARCHAR(</w:t>
+      </w:r>
+      <w:proofErr w:type="gramEnd"/>
+      <w:r>
+        <w:t>100) NOT NULL,</w:t>
+      </w:r>
+    </w:p>
+    <w:p>
+      <w:r>
+        <w:t>start_date DATE NOT NULL,</w:t>
+      </w:r>
+    </w:p>
+    <w:p>
+      <w:r>
+        <w:t>end_date DATE NOT NULL,</w:t>
+      </w:r>
+    </w:p>
+    <w:p>
+      <w:r>
+        <w:t xml:space="preserve">location </w:t>
+      </w:r>
+      <w:proofErr w:type="gramStart"/>
+      <w:r>
+        <w:t>VARCHAR(</w:t>
+      </w:r>
+      <w:proofErr w:type="gramEnd"/>
+      <w:r>
+        <w:t>100) NULL,</w:t>
+      </w:r>
+    </w:p>
+    <w:p>
+      <w:r>
+        <w:t xml:space="preserve">status </w:t>
+      </w:r>
+      <w:proofErr w:type="gramStart"/>
+      <w:r>
+        <w:t>VARCHAR(</w:t>
+      </w:r>
+      <w:proofErr w:type="gramEnd"/>
+      <w:r>
+        <w:t>20) DEFAULT 'Active',</w:t>
+      </w:r>
+    </w:p>
+    <w:p>
+      <w:r>
+        <w:t>PRIMARY KEY (batch_id)</w:t>
+      </w:r>
+    </w:p>
+    <w:p>
+      <w:r>
+        <w:t>) ENGINE=InnoDB;</w:t>
+      </w:r>
+    </w:p>
+    <w:p/>
+    <w:p>
+      <w:r>
+        <w:t>CREATE TABLE TRAINING_ASSIGNMENTS (</w:t>
+      </w:r>
+    </w:p>
+    <w:p>
+      <w:r>
+        <w:t>assignment_id INT NOT NULL,</w:t>
+      </w:r>
+    </w:p>
+    <w:p>
+      <w:r>
+        <w:t>employee_id INT NOT NULL,</w:t>
+      </w:r>
+    </w:p>
+    <w:p>
+      <w:r>
+        <w:t>batch_id INT NOT NULL,</w:t>
+      </w:r>
+    </w:p>
+    <w:p>
+      <w:r>
+        <w:t>assigned_date DATE NOT NULL,</w:t>
+      </w:r>
+    </w:p>
+    <w:p>
+      <w:r>
+        <w:t xml:space="preserve">status </w:t>
+      </w:r>
+      <w:proofErr w:type="gramStart"/>
+      <w:r>
+        <w:t>VARCHAR(</w:t>
+      </w:r>
+      <w:proofErr w:type="gramEnd"/>
+      <w:r>
+        <w:t>30) DEFAULT 'Not Started',</w:t>
+      </w:r>
+    </w:p>
+    <w:p>
+      <w:r>
+        <w:t>remarks TEXT NULL,</w:t>
+      </w:r>
+    </w:p>
+    <w:p>
+      <w:r>
+        <w:t>PRIMARY KEY (assignment_id),</w:t>
+      </w:r>
+    </w:p>
+    <w:p>
+      <w:r>
+        <w:t xml:space="preserve">FOREIGN KEY (employee_id) REFERENCES </w:t>
+      </w:r>
+      <w:proofErr w:type="gramStart"/>
+      <w:r>
+        <w:t>EMPLOYEES(</w:t>
+      </w:r>
+      <w:proofErr w:type="gramEnd"/>
+      <w:r>
+        <w:t>employee_id) ON DELETE CASCADE ON</w:t>
+      </w:r>
+    </w:p>
+    <w:p>
+      <w:r>
+        <w:t>UPDATE CASCADE,</w:t>
+      </w:r>
+    </w:p>
+    <w:p>
+      <w:r>
+        <w:t>FOREIGN KEY (batch_id) REFERENCES TRAINING_</w:t>
+      </w:r>
+      <w:proofErr w:type="gramStart"/>
+      <w:r>
+        <w:t>BATCHES(</w:t>
+      </w:r>
+      <w:proofErr w:type="gramEnd"/>
+      <w:r>
+        <w:t>batch_id) ON DELETE RESTRICT ON</w:t>
+      </w:r>
+    </w:p>
+    <w:p>
+      <w:r>
+        <w:t>UPDATE CASCADE</w:t>
+      </w:r>
+    </w:p>
+    <w:p>
+      <w:r>
+        <w:t>) ENGINE=InnoDB;</w:t>
+      </w:r>
+    </w:p>
+    <w:p>
+      <w:r>
+        <w:rPr>
+          <w:b/>
+          <w:bCs/>
+        </w:rPr>
+        <w:t>Milestone 5: Data Population &amp; Validation</w:t>
+      </w:r>
+    </w:p>
+    <w:p>
+      <w:r>
+        <w:t>The database was populated using 20+ records per table via structural bulk inserts. The following validation queries confirm the system's referential integrity and row counts.</w:t>
+      </w:r>
+    </w:p>
+    <w:p>
+      <w:r>
+        <w:lastRenderedPageBreak/>
+        <w:t xml:space="preserve">SELECT 'DEPARTMENTS' AS Table_Name, </w:t>
+      </w:r>
+      <w:proofErr w:type="gramStart"/>
+      <w:r>
+        <w:t>COUNT(</w:t>
+      </w:r>
+      <w:proofErr w:type="gramEnd"/>
+      <w:r>
+        <w:t>*) AS Record_Count FROM DEPARTMENTS</w:t>
+      </w:r>
+    </w:p>
+    <w:p>
+      <w:r>
+        <w:t xml:space="preserve">UNION SELECT 'DESIGNATIONS', </w:t>
+      </w:r>
+      <w:proofErr w:type="gramStart"/>
+      <w:r>
+        <w:t>COUNT(</w:t>
+      </w:r>
+      <w:proofErr w:type="gramEnd"/>
+      <w:r>
+        <w:t>*) FROM DESIGNATIONS</w:t>
+      </w:r>
+    </w:p>
+    <w:p>
+      <w:r>
+        <w:t xml:space="preserve">UNION SELECT 'POSTAL_CODES', </w:t>
+      </w:r>
+      <w:proofErr w:type="gramStart"/>
+      <w:r>
+        <w:t>COUNT(</w:t>
+      </w:r>
+      <w:proofErr w:type="gramEnd"/>
+      <w:r>
+        <w:t>*) FROM POSTAL_CODES</w:t>
+      </w:r>
+    </w:p>
+    <w:p>
+      <w:r>
+        <w:t xml:space="preserve">UNION SELECT 'EMPLOYEES', </w:t>
+      </w:r>
+      <w:proofErr w:type="gramStart"/>
+      <w:r>
+        <w:t>COUNT(</w:t>
+      </w:r>
+      <w:proofErr w:type="gramEnd"/>
+      <w:r>
+        <w:t>*) FROM EMPLOYEES</w:t>
+      </w:r>
+    </w:p>
+    <w:p>
+      <w:r>
+        <w:t xml:space="preserve">UNION SELECT 'ADDRESSES', </w:t>
+      </w:r>
+      <w:proofErr w:type="gramStart"/>
+      <w:r>
+        <w:t>COUNT(</w:t>
+      </w:r>
+      <w:proofErr w:type="gramEnd"/>
+      <w:r>
+        <w:t>*) FROM ADDRESSES</w:t>
+      </w:r>
+    </w:p>
+    <w:p>
+      <w:r>
+        <w:t xml:space="preserve">UNION SELECT 'USERS', </w:t>
+      </w:r>
+      <w:proofErr w:type="gramStart"/>
+      <w:r>
+        <w:t>COUNT(</w:t>
+      </w:r>
+      <w:proofErr w:type="gramEnd"/>
+      <w:r>
+        <w:t>*) FROM USERS</w:t>
+      </w:r>
+    </w:p>
+    <w:p>
+      <w:r>
+        <w:t xml:space="preserve">UNION SELECT 'TRAINING_ASSIGNMENTS', </w:t>
+      </w:r>
+      <w:proofErr w:type="gramStart"/>
+      <w:r>
+        <w:t>COUNT(</w:t>
+      </w:r>
+      <w:proofErr w:type="gramEnd"/>
+      <w:r>
+        <w:t>*) FROM TRAINING_ASSIGNMENTS;</w:t>
+      </w:r>
+    </w:p>
+    <w:p/>
+    <w:p>
+      <w:r>
+        <w:t>SELECT employee_id, first_name, last_name, email, employment_type</w:t>
+      </w:r>
+    </w:p>
+    <w:p>
+      <w:r>
+        <w:t>FROM EMPLOYEES</w:t>
+      </w:r>
+    </w:p>
+    <w:p>
+      <w:r>
+        <w:t>WHERE employee_code IS NULL OR join_date IS NULL;</w:t>
+      </w:r>
+    </w:p>
+    <w:p>
+      <w:r>
+        <w:t xml:space="preserve">SELECT </w:t>
+      </w:r>
+      <w:proofErr w:type="gramStart"/>
+      <w:r>
+        <w:t>a.address</w:t>
+      </w:r>
+      <w:proofErr w:type="gramEnd"/>
+      <w:r>
+        <w:t xml:space="preserve">_id, </w:t>
+      </w:r>
+      <w:proofErr w:type="gramStart"/>
+      <w:r>
+        <w:t>a.employee</w:t>
+      </w:r>
+      <w:proofErr w:type="gramEnd"/>
+      <w:r>
+        <w:t xml:space="preserve">_id, </w:t>
+      </w:r>
+      <w:proofErr w:type="gramStart"/>
+      <w:r>
+        <w:t>e.first</w:t>
+      </w:r>
+      <w:proofErr w:type="gramEnd"/>
+      <w:r>
+        <w:t xml:space="preserve">_name, </w:t>
+      </w:r>
+      <w:proofErr w:type="gramStart"/>
+      <w:r>
+        <w:t>e.last</w:t>
+      </w:r>
+      <w:proofErr w:type="gramEnd"/>
+      <w:r>
+        <w:t>_name</w:t>
+      </w:r>
+    </w:p>
+    <w:p>
+      <w:r>
+        <w:t>FROM ADDRESSES a</w:t>
+      </w:r>
+    </w:p>
+    <w:p>
+      <w:r>
+        <w:t xml:space="preserve">LEFT JOIN EMPLOYEES e ON </w:t>
+      </w:r>
+      <w:proofErr w:type="gramStart"/>
+      <w:r>
+        <w:t>a.employee</w:t>
+      </w:r>
+      <w:proofErr w:type="gramEnd"/>
+      <w:r>
+        <w:t xml:space="preserve">_id = </w:t>
+      </w:r>
+      <w:proofErr w:type="gramStart"/>
+      <w:r>
+        <w:t>e.employee</w:t>
+      </w:r>
+      <w:proofErr w:type="gramEnd"/>
+      <w:r>
+        <w:t>_id</w:t>
+      </w:r>
+    </w:p>
+    <w:p>
+      <w:r>
+        <w:t xml:space="preserve">WHERE </w:t>
+      </w:r>
+      <w:proofErr w:type="gramStart"/>
+      <w:r>
+        <w:t>e.employee</w:t>
+      </w:r>
+      <w:proofErr w:type="gramEnd"/>
+      <w:r>
+        <w:t>_id IS NULL;</w:t>
+      </w:r>
+    </w:p>
+    <w:p>
+      <w:pPr>
+        <w:rPr>
+          <w:b/>
+          <w:bCs/>
+          <w:sz w:val="36"/>
+          <w:szCs w:val="36"/>
+        </w:rPr>
+      </w:pPr>
+      <w:r>
+        <w:rPr>
+          <w:b/>
+          <w:bCs/>
+          <w:sz w:val="36"/>
+          <w:szCs w:val="36"/>
+        </w:rPr>
+        <w:t xml:space="preserve">All Uploaded </w:t>
+      </w:r>
+      <w:proofErr w:type="gramStart"/>
+      <w:r>
+        <w:rPr>
+          <w:b/>
+          <w:bCs/>
+          <w:sz w:val="36"/>
+          <w:szCs w:val="36"/>
+        </w:rPr>
+        <w:t>To</w:t>
+      </w:r>
+      <w:proofErr w:type="gramEnd"/>
+      <w:r>
+        <w:rPr>
+          <w:b/>
+          <w:bCs/>
+          <w:sz w:val="36"/>
+          <w:szCs w:val="36"/>
+        </w:rPr>
+        <w:t xml:space="preserve"> Git Repo</w:t>
+      </w:r>
+      <w:r>
+        <w:rPr>
+          <w:b/>
+          <w:bCs/>
+          <w:sz w:val="36"/>
+          <w:szCs w:val="36"/>
+        </w:rPr>
+        <w:t>:</w:t>
+      </w:r>
+    </w:p>
+    <w:p>
+      <w:pPr>
+        <w:rPr>
+          <w:sz w:val="36"/>
+          <w:szCs w:val="36"/>
+        </w:rPr>
+      </w:pPr>
+      <w:r>
+        <w:rPr>
+          <w:noProof/>
+          <w:sz w:val="36"/>
+          <w:szCs w:val="36"/>
+        </w:rPr>
+        <w:lastRenderedPageBreak/>
+        <w:drawing>
+          <wp:inline distT="0" distB="0" distL="0" distR="0" wp14:anchorId="55AAD32C" wp14:editId="7BD7915F">
+            <wp:extent cx="5943600" cy="2992120"/>
+            <wp:effectExtent l="0" t="0" r="0" b="0"/>
+            <wp:docPr id="798526749" name="Picture 1"/>
+            <wp:cNvGraphicFramePr>
+              <a:graphicFrameLocks xmlns:a="http://schemas.openxmlformats.org/drawingml/2006/main" noChangeAspect="1"/>
+            </wp:cNvGraphicFramePr>
+            <a:graphic xmlns:a="http://schemas.openxmlformats.org/drawingml/2006/main">
+              <a:graphicData uri="http://schemas.openxmlformats.org/drawingml/2006/picture">
+                <pic:pic xmlns:pic="http://schemas.openxmlformats.org/drawingml/2006/picture">
+                  <pic:nvPicPr>
+                    <pic:cNvPr id="798526749" name=""/>
+                    <pic:cNvPicPr/>
+                  </pic:nvPicPr>
+                  <pic:blipFill>
+                    <a:blip r:embed="rId7"/>
+                    <a:stretch>
+                      <a:fillRect/>
+                    </a:stretch>
+                  </pic:blipFill>
+                  <pic:spPr>
+                    <a:xfrm>
+                      <a:off x="0" y="0"/>
+                      <a:ext cx="5943600" cy="2992120"/>
+                    </a:xfrm>
+                    <a:prstGeom prst="rect">
+                      <a:avLst/>
+                    </a:prstGeom>
+                  </pic:spPr>
+                </pic:pic>
+              </a:graphicData>
+            </a:graphic>
+          </wp:inline>
+        </w:drawing>
+      </w:r>
+    </w:p>
+    <w:p/>
+    <w:p/>
     <w:p/>
     <w:p/>
     <w:p>
@@ -3017,6 +4253,119 @@
     </w:lvl>
   </w:abstractNum>
   <w:abstractNum w:abstractNumId="8" w15:restartNumberingAfterBreak="0">
+    <w:nsid w:val="2A9C6028"/>
+    <w:multiLevelType w:val="multilevel"/>
+    <w:tmpl w:val="2E30686E"/>
+    <w:lvl w:ilvl="0">
+      <w:start w:val="1"/>
+      <w:numFmt w:val="decimal"/>
+      <w:lvlText w:val="%1."/>
+      <w:lvlJc w:val="left"/>
+      <w:pPr>
+        <w:tabs>
+          <w:tab w:val="num" w:pos="720"/>
+        </w:tabs>
+        <w:ind w:left="720" w:hanging="360"/>
+      </w:pPr>
+    </w:lvl>
+    <w:lvl w:ilvl="1" w:tentative="1">
+      <w:start w:val="1"/>
+      <w:numFmt w:val="decimal"/>
+      <w:lvlText w:val="%2."/>
+      <w:lvlJc w:val="left"/>
+      <w:pPr>
+        <w:tabs>
+          <w:tab w:val="num" w:pos="1440"/>
+        </w:tabs>
+        <w:ind w:left="1440" w:hanging="360"/>
+      </w:pPr>
+    </w:lvl>
+    <w:lvl w:ilvl="2" w:tentative="1">
+      <w:start w:val="1"/>
+      <w:numFmt w:val="decimal"/>
+      <w:lvlText w:val="%3."/>
+      <w:lvlJc w:val="left"/>
+      <w:pPr>
+        <w:tabs>
+          <w:tab w:val="num" w:pos="2160"/>
+        </w:tabs>
+        <w:ind w:left="2160" w:hanging="360"/>
+      </w:pPr>
+    </w:lvl>
+    <w:lvl w:ilvl="3" w:tentative="1">
+      <w:start w:val="1"/>
+      <w:numFmt w:val="decimal"/>
+      <w:lvlText w:val="%4."/>
+      <w:lvlJc w:val="left"/>
+      <w:pPr>
+        <w:tabs>
+          <w:tab w:val="num" w:pos="2880"/>
+        </w:tabs>
+        <w:ind w:left="2880" w:hanging="360"/>
+      </w:pPr>
+    </w:lvl>
+    <w:lvl w:ilvl="4" w:tentative="1">
+      <w:start w:val="1"/>
+      <w:numFmt w:val="decimal"/>
+      <w:lvlText w:val="%5."/>
+      <w:lvlJc w:val="left"/>
+      <w:pPr>
+        <w:tabs>
+          <w:tab w:val="num" w:pos="3600"/>
+        </w:tabs>
+        <w:ind w:left="3600" w:hanging="360"/>
+      </w:pPr>
+    </w:lvl>
+    <w:lvl w:ilvl="5" w:tentative="1">
+      <w:start w:val="1"/>
+      <w:numFmt w:val="decimal"/>
+      <w:lvlText w:val="%6."/>
+      <w:lvlJc w:val="left"/>
+      <w:pPr>
+        <w:tabs>
+          <w:tab w:val="num" w:pos="4320"/>
+        </w:tabs>
+        <w:ind w:left="4320" w:hanging="360"/>
+      </w:pPr>
+    </w:lvl>
+    <w:lvl w:ilvl="6" w:tentative="1">
+      <w:start w:val="1"/>
+      <w:numFmt w:val="decimal"/>
+      <w:lvlText w:val="%7."/>
+      <w:lvlJc w:val="left"/>
+      <w:pPr>
+        <w:tabs>
+          <w:tab w:val="num" w:pos="5040"/>
+        </w:tabs>
+        <w:ind w:left="5040" w:hanging="360"/>
+      </w:pPr>
+    </w:lvl>
+    <w:lvl w:ilvl="7" w:tentative="1">
+      <w:start w:val="1"/>
+      <w:numFmt w:val="decimal"/>
+      <w:lvlText w:val="%8."/>
+      <w:lvlJc w:val="left"/>
+      <w:pPr>
+        <w:tabs>
+          <w:tab w:val="num" w:pos="5760"/>
+        </w:tabs>
+        <w:ind w:left="5760" w:hanging="360"/>
+      </w:pPr>
+    </w:lvl>
+    <w:lvl w:ilvl="8" w:tentative="1">
+      <w:start w:val="1"/>
+      <w:numFmt w:val="decimal"/>
+      <w:lvlText w:val="%9."/>
+      <w:lvlJc w:val="left"/>
+      <w:pPr>
+        <w:tabs>
+          <w:tab w:val="num" w:pos="6480"/>
+        </w:tabs>
+        <w:ind w:left="6480" w:hanging="360"/>
+      </w:pPr>
+    </w:lvl>
+  </w:abstractNum>
+  <w:abstractNum w:abstractNumId="9" w15:restartNumberingAfterBreak="0">
     <w:nsid w:val="320353DE"/>
     <w:multiLevelType w:val="multilevel"/>
     <w:tmpl w:val="675218F0"/>
@@ -3165,7 +4514,7 @@
       </w:rPr>
     </w:lvl>
   </w:abstractNum>
-  <w:abstractNum w:abstractNumId="9" w15:restartNumberingAfterBreak="0">
+  <w:abstractNum w:abstractNumId="10" w15:restartNumberingAfterBreak="0">
     <w:nsid w:val="321516BC"/>
     <w:multiLevelType w:val="multilevel"/>
     <w:tmpl w:val="E1F4DA06"/>
@@ -3314,7 +4663,7 @@
       </w:rPr>
     </w:lvl>
   </w:abstractNum>
-  <w:abstractNum w:abstractNumId="10" w15:restartNumberingAfterBreak="0">
+  <w:abstractNum w:abstractNumId="11" w15:restartNumberingAfterBreak="0">
     <w:nsid w:val="36477EA9"/>
     <w:multiLevelType w:val="multilevel"/>
     <w:tmpl w:val="D0F0FD04"/>
@@ -3463,7 +4812,7 @@
       </w:rPr>
     </w:lvl>
   </w:abstractNum>
-  <w:abstractNum w:abstractNumId="11" w15:restartNumberingAfterBreak="0">
+  <w:abstractNum w:abstractNumId="12" w15:restartNumberingAfterBreak="0">
     <w:nsid w:val="3A5A4AF0"/>
     <w:multiLevelType w:val="multilevel"/>
     <w:tmpl w:val="4AC03D5A"/>
@@ -3612,7 +4961,7 @@
       </w:rPr>
     </w:lvl>
   </w:abstractNum>
-  <w:abstractNum w:abstractNumId="12" w15:restartNumberingAfterBreak="0">
+  <w:abstractNum w:abstractNumId="13" w15:restartNumberingAfterBreak="0">
     <w:nsid w:val="425338A4"/>
     <w:multiLevelType w:val="multilevel"/>
     <w:tmpl w:val="48E26B66"/>
@@ -3761,7 +5110,7 @@
       </w:rPr>
     </w:lvl>
   </w:abstractNum>
-  <w:abstractNum w:abstractNumId="13" w15:restartNumberingAfterBreak="0">
+  <w:abstractNum w:abstractNumId="14" w15:restartNumberingAfterBreak="0">
     <w:nsid w:val="49492DE1"/>
     <w:multiLevelType w:val="multilevel"/>
     <w:tmpl w:val="8A14C748"/>
@@ -3910,7 +5259,7 @@
       </w:rPr>
     </w:lvl>
   </w:abstractNum>
-  <w:abstractNum w:abstractNumId="14" w15:restartNumberingAfterBreak="0">
+  <w:abstractNum w:abstractNumId="15" w15:restartNumberingAfterBreak="0">
     <w:nsid w:val="4EE73DA0"/>
     <w:multiLevelType w:val="multilevel"/>
     <w:tmpl w:val="A9362AD2"/>
@@ -4059,7 +5408,7 @@
       </w:rPr>
     </w:lvl>
   </w:abstractNum>
-  <w:abstractNum w:abstractNumId="15" w15:restartNumberingAfterBreak="0">
+  <w:abstractNum w:abstractNumId="16" w15:restartNumberingAfterBreak="0">
     <w:nsid w:val="533D0A56"/>
     <w:multiLevelType w:val="multilevel"/>
     <w:tmpl w:val="820ED6B2"/>
@@ -4208,7 +5557,7 @@
       </w:rPr>
     </w:lvl>
   </w:abstractNum>
-  <w:abstractNum w:abstractNumId="16" w15:restartNumberingAfterBreak="0">
+  <w:abstractNum w:abstractNumId="17" w15:restartNumberingAfterBreak="0">
     <w:nsid w:val="54521956"/>
     <w:multiLevelType w:val="multilevel"/>
     <w:tmpl w:val="6B88AC96"/>
@@ -4357,7 +5706,7 @@
       </w:rPr>
     </w:lvl>
   </w:abstractNum>
-  <w:abstractNum w:abstractNumId="17" w15:restartNumberingAfterBreak="0">
+  <w:abstractNum w:abstractNumId="18" w15:restartNumberingAfterBreak="0">
     <w:nsid w:val="580C086A"/>
     <w:multiLevelType w:val="multilevel"/>
     <w:tmpl w:val="1166DCCA"/>
@@ -4506,7 +5855,7 @@
       </w:rPr>
     </w:lvl>
   </w:abstractNum>
-  <w:abstractNum w:abstractNumId="18" w15:restartNumberingAfterBreak="0">
+  <w:abstractNum w:abstractNumId="19" w15:restartNumberingAfterBreak="0">
     <w:nsid w:val="63DF388B"/>
     <w:multiLevelType w:val="multilevel"/>
     <w:tmpl w:val="D0D296E2"/>
@@ -4655,7 +6004,7 @@
       </w:rPr>
     </w:lvl>
   </w:abstractNum>
-  <w:abstractNum w:abstractNumId="19" w15:restartNumberingAfterBreak="0">
+  <w:abstractNum w:abstractNumId="20" w15:restartNumberingAfterBreak="0">
     <w:nsid w:val="64347D35"/>
     <w:multiLevelType w:val="multilevel"/>
     <w:tmpl w:val="792C243E"/>
@@ -4804,7 +6153,7 @@
       </w:rPr>
     </w:lvl>
   </w:abstractNum>
-  <w:abstractNum w:abstractNumId="20" w15:restartNumberingAfterBreak="0">
+  <w:abstractNum w:abstractNumId="21" w15:restartNumberingAfterBreak="0">
     <w:nsid w:val="65926AA3"/>
     <w:multiLevelType w:val="multilevel"/>
     <w:tmpl w:val="99B4347C"/>
@@ -4953,7 +6302,7 @@
       </w:rPr>
     </w:lvl>
   </w:abstractNum>
-  <w:abstractNum w:abstractNumId="21" w15:restartNumberingAfterBreak="0">
+  <w:abstractNum w:abstractNumId="22" w15:restartNumberingAfterBreak="0">
     <w:nsid w:val="725A46C9"/>
     <w:multiLevelType w:val="multilevel"/>
     <w:tmpl w:val="B8CE57BC"/>
@@ -5102,7 +6451,7 @@
       </w:rPr>
     </w:lvl>
   </w:abstractNum>
-  <w:abstractNum w:abstractNumId="22" w15:restartNumberingAfterBreak="0">
+  <w:abstractNum w:abstractNumId="23" w15:restartNumberingAfterBreak="0">
     <w:nsid w:val="75691303"/>
     <w:multiLevelType w:val="multilevel"/>
     <w:tmpl w:val="FF40DFFC"/>
@@ -5251,7 +6600,7 @@
       </w:rPr>
     </w:lvl>
   </w:abstractNum>
-  <w:abstractNum w:abstractNumId="23" w15:restartNumberingAfterBreak="0">
+  <w:abstractNum w:abstractNumId="24" w15:restartNumberingAfterBreak="0">
     <w:nsid w:val="7CFB7B0B"/>
     <w:multiLevelType w:val="multilevel"/>
     <w:tmpl w:val="67EEB470"/>
@@ -5400,7 +6749,7 @@
       </w:rPr>
     </w:lvl>
   </w:abstractNum>
-  <w:abstractNum w:abstractNumId="24" w15:restartNumberingAfterBreak="0">
+  <w:abstractNum w:abstractNumId="25" w15:restartNumberingAfterBreak="0">
     <w:nsid w:val="7E4E395B"/>
     <w:multiLevelType w:val="multilevel"/>
     <w:tmpl w:val="178CD838"/>
@@ -5550,67 +6899,67 @@
     </w:lvl>
   </w:abstractNum>
   <w:num w:numId="1" w16cid:durableId="1808619106">
-    <w:abstractNumId w:val="20"/>
+    <w:abstractNumId w:val="21"/>
   </w:num>
   <w:num w:numId="2" w16cid:durableId="287978320">
-    <w:abstractNumId w:val="11"/>
+    <w:abstractNumId w:val="12"/>
   </w:num>
   <w:num w:numId="3" w16cid:durableId="1331373099">
-    <w:abstractNumId w:val="16"/>
+    <w:abstractNumId w:val="17"/>
   </w:num>
   <w:num w:numId="4" w16cid:durableId="175536961">
-    <w:abstractNumId w:val="8"/>
+    <w:abstractNumId w:val="9"/>
   </w:num>
   <w:num w:numId="5" w16cid:durableId="1195190385">
-    <w:abstractNumId w:val="12"/>
+    <w:abstractNumId w:val="13"/>
   </w:num>
   <w:num w:numId="6" w16cid:durableId="1240749130">
     <w:abstractNumId w:val="7"/>
   </w:num>
   <w:num w:numId="7" w16cid:durableId="1997687201">
-    <w:abstractNumId w:val="18"/>
+    <w:abstractNumId w:val="19"/>
   </w:num>
   <w:num w:numId="8" w16cid:durableId="332876461">
-    <w:abstractNumId w:val="21"/>
+    <w:abstractNumId w:val="22"/>
   </w:num>
   <w:num w:numId="9" w16cid:durableId="608395003">
     <w:abstractNumId w:val="2"/>
   </w:num>
   <w:num w:numId="10" w16cid:durableId="774404902">
-    <w:abstractNumId w:val="24"/>
+    <w:abstractNumId w:val="25"/>
   </w:num>
   <w:num w:numId="11" w16cid:durableId="1837106755">
     <w:abstractNumId w:val="6"/>
   </w:num>
   <w:num w:numId="12" w16cid:durableId="634801240">
-    <w:abstractNumId w:val="22"/>
+    <w:abstractNumId w:val="23"/>
   </w:num>
   <w:num w:numId="13" w16cid:durableId="1084958193">
     <w:abstractNumId w:val="1"/>
   </w:num>
   <w:num w:numId="14" w16cid:durableId="2010407564">
-    <w:abstractNumId w:val="15"/>
+    <w:abstractNumId w:val="16"/>
   </w:num>
   <w:num w:numId="15" w16cid:durableId="1489050624">
-    <w:abstractNumId w:val="17"/>
+    <w:abstractNumId w:val="18"/>
   </w:num>
   <w:num w:numId="16" w16cid:durableId="1626617476">
-    <w:abstractNumId w:val="19"/>
+    <w:abstractNumId w:val="20"/>
   </w:num>
   <w:num w:numId="17" w16cid:durableId="2084451219">
     <w:abstractNumId w:val="3"/>
   </w:num>
   <w:num w:numId="18" w16cid:durableId="1604026004">
-    <w:abstractNumId w:val="13"/>
+    <w:abstractNumId w:val="14"/>
   </w:num>
   <w:num w:numId="19" w16cid:durableId="590433889">
-    <w:abstractNumId w:val="14"/>
+    <w:abstractNumId w:val="15"/>
   </w:num>
   <w:num w:numId="20" w16cid:durableId="365452852">
-    <w:abstractNumId w:val="10"/>
+    <w:abstractNumId w:val="11"/>
   </w:num>
   <w:num w:numId="21" w16cid:durableId="1239172203">
-    <w:abstractNumId w:val="9"/>
+    <w:abstractNumId w:val="10"/>
   </w:num>
   <w:num w:numId="22" w16cid:durableId="353922633">
     <w:abstractNumId w:val="0"/>
@@ -5622,7 +6971,10 @@
     <w:abstractNumId w:val="4"/>
   </w:num>
   <w:num w:numId="25" w16cid:durableId="1551573594">
-    <w:abstractNumId w:val="23"/>
+    <w:abstractNumId w:val="24"/>
+  </w:num>
+  <w:num w:numId="26" w16cid:durableId="1367220359">
+    <w:abstractNumId w:val="8"/>
   </w:num>
 </w:numbering>
 </file>
@@ -6230,7 +7582,6 @@
   <w:style w:type="character" w:default="1" w:styleId="DefaultParagraphFont">
     <w:name w:val="Default Paragraph Font"/>
     <w:uiPriority w:val="1"/>
-    <w:semiHidden/>
     <w:unhideWhenUsed/>
   </w:style>
   <w:style w:type="table" w:default="1" w:styleId="TableNormal">

</xml_diff>